<commit_message>
gitAuto manual push @ 2026-05-06 22:15:04
</commit_message>
<xml_diff>
--- a/docs/Template/网络管理与运维实验1报告模板. 班级 学号 姓名.docx
+++ b/docs/Template/网络管理与运维实验1报告模板. 班级 学号 姓名.docx
@@ -112,6 +112,8 @@
           </w:tcPr>
           <w:p>
             <w:pPr>
+              <w:spacing w:line="480" w:lineRule="auto"/>
+              <w:jc w:val="left"/>
               <w:rPr>
                 <w:rFonts w:hint="default" w:eastAsiaTheme="minorEastAsia"/>
                 <w:sz w:val="24"/>
@@ -119,36 +121,13 @@
                 <w:lang w:val="en-US" w:eastAsia="zh-CN"/>
               </w:rPr>
             </w:pPr>
-            <w:bookmarkStart w:id="0" w:name="_GoBack"/>
             <w:r>
               <w:rPr>
                 <w:rFonts w:hint="eastAsia"/>
                 <w:lang w:val="en-US" w:eastAsia="zh-CN"/>
               </w:rPr>
-              <w:t xml:space="preserve">项目7 </w:t>
-            </w:r>
-            <w:r>
-              <w:rPr>
-                <w:rFonts w:hint="eastAsia"/>
-              </w:rPr>
-              <w:t>使用</w:t>
-            </w:r>
-            <w:r>
-              <w:rPr>
-                <w:rFonts w:hint="eastAsia"/>
-                <w:sz w:val="24"/>
-                <w:szCs w:val="24"/>
-                <w:lang w:val="en-US" w:eastAsia="zh-CN"/>
-              </w:rPr>
-              <w:t>Telemetry</w:t>
-            </w:r>
-            <w:r>
-              <w:rPr>
-                <w:rFonts w:hint="eastAsia"/>
-              </w:rPr>
-              <w:t>实时监控CPU和内存使用率</w:t>
-            </w:r>
-            <w:bookmarkEnd w:id="0"/>
+              <w:t>项目9 使用ansible进行网络自动化运维</w:t>
+            </w:r>
           </w:p>
         </w:tc>
       </w:tr>
@@ -203,12 +182,16 @@
           </w:tcPr>
           <w:p>
             <w:pPr>
-              <w:jc w:val="center"/>
-              <w:rPr>
-                <w:sz w:val="24"/>
-                <w:szCs w:val="24"/>
+              <w:jc w:val="left"/>
+              <w:rPr>
+                <w:rFonts w:hint="default" w:eastAsiaTheme="minorEastAsia"/>
+                <w:sz w:val="24"/>
+                <w:szCs w:val="24"/>
+                <w:lang w:val="en-US" w:eastAsia="zh-CN"/>
               </w:rPr>
             </w:pPr>
+            <w:bookmarkStart w:id="0" w:name="_GoBack"/>
+            <w:bookmarkEnd w:id="0"/>
           </w:p>
         </w:tc>
       </w:tr>

</xml_diff>